<commit_message>
Align the manuscript with CIE conventions
</commit_message>
<xml_diff>
--- a/docs/paper/MLOR_MANUSCRIPT.docx
+++ b/docs/paper/MLOR_MANUSCRIPT.docx
@@ -19,6 +19,54 @@
           <w:i/>
         </w:rPr>
         <w:t>Working manuscript. Application/extension positioning; target journals AOR, ITOR, or CIE.</w:t>
+      </w:r>
+    </w:p>
+    <w:p>
+      <w:pPr>
+        <w:pStyle w:val="Heading2"/>
+      </w:pPr>
+      <w:r>
+        <w:t>Highlights</w:t>
+      </w:r>
+    </w:p>
+    <w:p>
+      <w:pPr>
+        <w:pStyle w:val="ListBullet"/>
+      </w:pPr>
+      <w:r>
+        <w:t>Inventory age and store MLOR create an age–distance–threshold matching problem.</w:t>
+      </w:r>
+    </w:p>
+    <w:p>
+      <w:pPr>
+        <w:pStyle w:val="ListBullet"/>
+      </w:pPr>
+      <w:r>
+        <w:t>Age-aware plans can open different warehouses and assign stores differently.</w:t>
+      </w:r>
+    </w:p>
+    <w:p>
+      <w:pPr>
+        <w:pStyle w:val="ListBullet"/>
+      </w:pPr>
+      <w:r>
+        <w:t>Exact subset DP solves 8- and 12-store instances; ALNS is near-optimal at 12.</w:t>
+      </w:r>
+    </w:p>
+    <w:p>
+      <w:pPr>
+        <w:pStyle w:val="ListBullet"/>
+      </w:pPr>
+      <w:r>
+        <w:t>A freshest-first rule is a reasonable default; oldest-first is not.</w:t>
+      </w:r>
+    </w:p>
+    <w:p>
+      <w:pPr>
+        <w:pStyle w:val="ListBullet"/>
+      </w:pPr>
+      <w:r>
+        <w:t>Gains are conditional on rejection cost and unit-demand scope.</w:t>
       </w:r>
     </w:p>
     <w:p>
@@ -64,7 +112,7 @@
     </w:p>
     <w:p>
       <w:r>
-        <w:t>Our contributions are therefore modest and specific. First, we formulate a location-routing model in which the shelf-life condition is an arrival deadline determined jointly by warehouse age and store threshold. Second, we give an exact subset dynamic program for small and medium instances and an age-feasible ALNS for larger ones, and we compare both with practical policies rather than only with an age-blind straw man. Third, we isolate the mechanism: removing age and MLOR together eliminates the decision difference, while removing either one alone leaves a smaller effect. We do not claim a new problem class; the evidence supports a conditional decision mechanism, not a field recommendation.</w:t>
+        <w:t>Three contributions follow. (i) Modeling: we formulate a location-routing model in which the shelf-life condition is an arrival deadline determined jointly by warehouse age and store threshold, and we state the operational assumptions that delimit its scope. (ii) Method: we give an exact subset dynamic program for small and medium instances and an age-feasible ALNS for larger ones; the ALNS neighborhood is chosen because cross-warehouse reassignment, not route reordering, is the move that the mechanism requires. (iii) Empirical: we compare against an age-blind exact plan, three practical policies and a rule-plus-local-search baseline, isolate the age–MLOR interaction with a 2×2 check, and report confidence intervals rather than only point estimates. We do not claim a new problem class; the evidence supports a conditional decision mechanism, not a field recommendation.</w:t>
       </w:r>
     </w:p>
     <w:p>
@@ -129,6 +177,29 @@
     </w:p>
     <w:p>
       <w:r>
+        <w:t xml:space="preserve">Two gaps follow. The </w:t>
+      </w:r>
+      <w:r>
+        <w:rPr>
+          <w:b/>
+        </w:rPr>
+        <w:t>problem gap</w:t>
+      </w:r>
+      <w:r>
+        <w:t xml:space="preserve"> is that a store-specific delivery threshold has not been embedded in a location-routing model in the full texts we read; the threshold is not a stockout-probability service level and is not a time window. The </w:t>
+      </w:r>
+      <w:r>
+        <w:rPr>
+          <w:b/>
+        </w:rPr>
+        <w:t>method gap</w:t>
+      </w:r>
+      <w:r>
+        <w:t xml:space="preserve"> is that the resulting route-feasibility subproblem is NP-complete, so neither a sorting rule nor a route-level local search is sufficient; the solution method must enumerate orders or repair them explicitly. We provide evidence for the first gap and a proof for the second within the stated scope, not a claim that no related model exists.</w:t>
+      </w:r>
+    </w:p>
+    <w:p>
+      <w:r>
         <w:rPr>
           <w:b/>
         </w:rPr>
@@ -161,7 +232,7 @@
     </w:p>
     <w:p>
       <w:r>
-        <w:t>The assumptions are explicit because they define the scope of the results. The model is single-period and deterministic; inventory age does not evolve within the period. The network is single-echelon, from warehouses to stores; the contest background includes a central warehouse, but no CDC-to-RDC leg is modeled. Demand is unit-sized, so vehicle capacity is expressed as a number of stores. Stores have no inventory state; MLOR is a delivery acceptance condition, not the shelf life at which the product is sold. Travel time is deterministic and proportional to distance. These choices are summarized in Table 1.</w:t>
+        <w:t>The assumptions are explicit because they define the scope of the results. The model is single-period and deterministic; inventory age does not evolve within the period. The network is single-echelon, from warehouses to stores; the contest background includes a central warehouse, but no CDC-to-RDC leg is modeled. Demand is unit-sized, so vehicle capacity is expressed as a number of stores. Stores have no inventory state; MLOR is a delivery acceptance condition, not the shelf life at which the product is sold. Travel time is deterministic and proportional to distance. These choices are summarized in Table 2.</w:t>
       </w:r>
     </w:p>
     <w:p>
@@ -169,7 +240,321 @@
         <w:rPr>
           <w:i/>
         </w:rPr>
-        <w:t>*Table 1. Modeled and unmodeled dimensions.*</w:t>
+        <w:t>*Table 1. Notation.*</w:t>
+      </w:r>
+    </w:p>
+    <w:tbl>
+      <w:tblPr>
+        <w:tblStyle w:val="TableGrid"/>
+        <w:tblW w:type="auto" w:w="0"/>
+        <w:tblLook w:firstColumn="1" w:firstRow="1" w:lastColumn="0" w:lastRow="0" w:noHBand="0" w:noVBand="1" w:val="04A0"/>
+      </w:tblPr>
+      <w:tblGrid>
+        <w:gridCol w:w="4536"/>
+        <w:gridCol w:w="4536"/>
+      </w:tblGrid>
+      <w:tr>
+        <w:tc>
+          <w:tcPr>
+            <w:tcW w:type="dxa" w:w="4536"/>
+          </w:tcPr>
+          <w:p>
+            <w:r/>
+            <w:r>
+              <w:rPr>
+                <w:b/>
+              </w:rPr>
+              <w:t>Symbol</w:t>
+            </w:r>
+          </w:p>
+        </w:tc>
+        <w:tc>
+          <w:tcPr>
+            <w:tcW w:type="dxa" w:w="4536"/>
+          </w:tcPr>
+          <w:p>
+            <w:r/>
+            <w:r>
+              <w:rPr>
+                <w:b/>
+              </w:rPr>
+              <w:t>Meaning</w:t>
+            </w:r>
+          </w:p>
+        </w:tc>
+      </w:tr>
+      <w:tr>
+        <w:tc>
+          <w:tcPr>
+            <w:tcW w:type="dxa" w:w="4536"/>
+          </w:tcPr>
+          <w:p>
+            <w:r/>
+            <w:r>
+              <w:t>I, J, V</w:t>
+            </w:r>
+          </w:p>
+        </w:tc>
+        <w:tc>
+          <w:tcPr>
+            <w:tcW w:type="dxa" w:w="4536"/>
+          </w:tcPr>
+          <w:p>
+            <w:r/>
+            <w:r>
+              <w:t>Candidate warehouses, stores, vehicles</w:t>
+            </w:r>
+          </w:p>
+        </w:tc>
+      </w:tr>
+      <w:tr>
+        <w:tc>
+          <w:tcPr>
+            <w:tcW w:type="dxa" w:w="4536"/>
+          </w:tcPr>
+          <w:p>
+            <w:r/>
+            <w:r>
+              <w:t>L</w:t>
+            </w:r>
+          </w:p>
+        </w:tc>
+        <w:tc>
+          <w:tcPr>
+            <w:tcW w:type="dxa" w:w="4536"/>
+          </w:tcPr>
+          <w:p>
+            <w:r/>
+            <w:r>
+              <w:t>Shelf life</w:t>
+            </w:r>
+          </w:p>
+        </w:tc>
+      </w:tr>
+      <w:tr>
+        <w:tc>
+          <w:tcPr>
+            <w:tcW w:type="dxa" w:w="4536"/>
+          </w:tcPr>
+          <w:p>
+            <w:r/>
+            <w:r>
+              <w:t>a_i</w:t>
+            </w:r>
+          </w:p>
+        </w:tc>
+        <w:tc>
+          <w:tcPr>
+            <w:tcW w:type="dxa" w:w="4536"/>
+          </w:tcPr>
+          <w:p>
+            <w:r/>
+            <w:r>
+              <w:t>Age of the batch at warehouse i</w:t>
+            </w:r>
+          </w:p>
+        </w:tc>
+      </w:tr>
+      <w:tr>
+        <w:tc>
+          <w:tcPr>
+            <w:tcW w:type="dxa" w:w="4536"/>
+          </w:tcPr>
+          <w:p>
+            <w:r/>
+            <w:r>
+              <w:t>m_j</w:t>
+            </w:r>
+          </w:p>
+        </w:tc>
+        <w:tc>
+          <w:tcPr>
+            <w:tcW w:type="dxa" w:w="4536"/>
+          </w:tcPr>
+          <w:p>
+            <w:r/>
+            <w:r>
+              <w:t>Store j's minimum remaining shelf life</w:t>
+            </w:r>
+          </w:p>
+        </w:tc>
+      </w:tr>
+      <w:tr>
+        <w:tc>
+          <w:tcPr>
+            <w:tcW w:type="dxa" w:w="4536"/>
+          </w:tcPr>
+          <w:p>
+            <w:r/>
+            <w:r>
+              <w:t>d_j</w:t>
+            </w:r>
+          </w:p>
+        </w:tc>
+        <w:tc>
+          <w:tcPr>
+            <w:tcW w:type="dxa" w:w="4536"/>
+          </w:tcPr>
+          <w:p>
+            <w:r/>
+            <w:r>
+              <w:t>Demand (d_j = 1 in the unit-demand abstraction)</w:t>
+            </w:r>
+          </w:p>
+        </w:tc>
+      </w:tr>
+      <w:tr>
+        <w:tc>
+          <w:tcPr>
+            <w:tcW w:type="dxa" w:w="4536"/>
+          </w:tcPr>
+          <w:p>
+            <w:r/>
+            <w:r>
+              <w:t>Q</w:t>
+            </w:r>
+          </w:p>
+        </w:tc>
+        <w:tc>
+          <w:tcPr>
+            <w:tcW w:type="dxa" w:w="4536"/>
+          </w:tcPr>
+          <w:p>
+            <w:r/>
+            <w:r>
+              <w:t>Vehicle capacity in demand units</w:t>
+            </w:r>
+          </w:p>
+        </w:tc>
+      </w:tr>
+      <w:tr>
+        <w:tc>
+          <w:tcPr>
+            <w:tcW w:type="dxa" w:w="4536"/>
+          </w:tcPr>
+          <w:p>
+            <w:r/>
+            <w:r>
+              <w:t>τ_kj, c_kj</w:t>
+            </w:r>
+          </w:p>
+        </w:tc>
+        <w:tc>
+          <w:tcPr>
+            <w:tcW w:type="dxa" w:w="4536"/>
+          </w:tcPr>
+          <w:p>
+            <w:r/>
+            <w:r>
+              <w:t>Travel time and cost from k to j</w:t>
+            </w:r>
+          </w:p>
+        </w:tc>
+      </w:tr>
+      <w:tr>
+        <w:tc>
+          <w:tcPr>
+            <w:tcW w:type="dxa" w:w="4536"/>
+          </w:tcPr>
+          <w:p>
+            <w:r/>
+            <w:r>
+              <w:t>F_i, G, P</w:t>
+            </w:r>
+          </w:p>
+        </w:tc>
+        <w:tc>
+          <w:tcPr>
+            <w:tcW w:type="dxa" w:w="4536"/>
+          </w:tcPr>
+          <w:p>
+            <w:r/>
+            <w:r>
+              <w:t>Opening, vehicle fixed, unserved penalty</w:t>
+            </w:r>
+          </w:p>
+        </w:tc>
+      </w:tr>
+      <w:tr>
+        <w:tc>
+          <w:tcPr>
+            <w:tcW w:type="dxa" w:w="4536"/>
+          </w:tcPr>
+          <w:p>
+            <w:r/>
+            <w:r>
+              <w:t>y_i, r_v</w:t>
+            </w:r>
+          </w:p>
+        </w:tc>
+        <w:tc>
+          <w:tcPr>
+            <w:tcW w:type="dxa" w:w="4536"/>
+          </w:tcPr>
+          <w:p>
+            <w:r/>
+            <w:r>
+              <w:t>Warehouse open, vehicle used</w:t>
+            </w:r>
+          </w:p>
+        </w:tc>
+      </w:tr>
+      <w:tr>
+        <w:tc>
+          <w:tcPr>
+            <w:tcW w:type="dxa" w:w="4536"/>
+          </w:tcPr>
+          <w:p>
+            <w:r/>
+            <w:r>
+              <w:t>x_kjv</w:t>
+            </w:r>
+          </w:p>
+        </w:tc>
+        <w:tc>
+          <w:tcPr>
+            <w:tcW w:type="dxa" w:w="4536"/>
+          </w:tcPr>
+          <w:p>
+            <w:r/>
+            <w:r>
+              <w:t>Vehicle v travels from k to j</w:t>
+            </w:r>
+          </w:p>
+        </w:tc>
+      </w:tr>
+      <w:tr>
+        <w:tc>
+          <w:tcPr>
+            <w:tcW w:type="dxa" w:w="4536"/>
+          </w:tcPr>
+          <w:p>
+            <w:r/>
+            <w:r>
+              <w:t>T_j, s_j</w:t>
+            </w:r>
+          </w:p>
+        </w:tc>
+        <w:tc>
+          <w:tcPr>
+            <w:tcW w:type="dxa" w:w="4536"/>
+          </w:tcPr>
+          <w:p>
+            <w:r/>
+            <w:r>
+              <w:t>Arrival time, store served</w:t>
+            </w:r>
+          </w:p>
+        </w:tc>
+      </w:tr>
+    </w:tbl>
+    <w:p/>
+    <w:p>
+      <w:r>
+        <w:rPr>
+          <w:i/>
+        </w:rPr>
+        <w:t>*Table 2. Modeled and unmodeled dimensions.*</w:t>
       </w:r>
     </w:p>
     <w:tbl>
@@ -777,6 +1162,11 @@
       </w:r>
     </w:p>
     <w:p>
+      <w:r>
+        <w:t>Feasibility is maintained by discarding any candidate route whose arrival times violate a store deadline. The procedure stops after the iteration budget and returns the best feasible solution seen. One iteration costs O(k n²) in the worst case for k removed stores and n stores, and the memory footprint is O(n). No commercial solver is used inside the loop, so the reported runtimes are the algorithm's own.</w:t>
+      </w:r>
+    </w:p>
+    <w:p>
       <w:pPr>
         <w:pStyle w:val="Heading3"/>
       </w:pPr>
@@ -810,6 +1200,248 @@
         <w:t>All synthetic instances use the same generator. Shelf life is 6 days; warehouse ages are 0, 2.5 and 4.5 days; store thresholds are 1, 2 or 3 days; vehicle capacity is 4 stores; opening cost is 100; vehicle fixed cost is 50; transport cost is 0.5 per km; speed is 100 km per day; the unserved penalty is 200, varied in the sensitivity; store coordinates are uniform on [0,300]². The 12- and 20-store runs use the same generator with more stores. Each experiment is run through the repository entry point with an isolated output directory, and the reported numbers are taken from those outputs.</w:t>
       </w:r>
     </w:p>
+    <w:p>
+      <w:r>
+        <w:rPr>
+          <w:i/>
+        </w:rPr>
+        <w:t>*Table 3. Experimental settings.*</w:t>
+      </w:r>
+    </w:p>
+    <w:tbl>
+      <w:tblPr>
+        <w:tblStyle w:val="TableGrid"/>
+        <w:tblW w:type="auto" w:w="0"/>
+        <w:tblLook w:firstColumn="1" w:firstRow="1" w:lastColumn="0" w:lastRow="0" w:noHBand="0" w:noVBand="1" w:val="04A0"/>
+      </w:tblPr>
+      <w:tblGrid>
+        <w:gridCol w:w="4536"/>
+        <w:gridCol w:w="4536"/>
+      </w:tblGrid>
+      <w:tr>
+        <w:tc>
+          <w:tcPr>
+            <w:tcW w:type="dxa" w:w="4536"/>
+          </w:tcPr>
+          <w:p>
+            <w:r/>
+            <w:r>
+              <w:rPr>
+                <w:b/>
+              </w:rPr>
+              <w:t>Element</w:t>
+            </w:r>
+          </w:p>
+        </w:tc>
+        <w:tc>
+          <w:tcPr>
+            <w:tcW w:type="dxa" w:w="4536"/>
+          </w:tcPr>
+          <w:p>
+            <w:r/>
+            <w:r>
+              <w:rPr>
+                <w:b/>
+              </w:rPr>
+              <w:t>Setting</w:t>
+            </w:r>
+          </w:p>
+        </w:tc>
+      </w:tr>
+      <w:tr>
+        <w:tc>
+          <w:tcPr>
+            <w:tcW w:type="dxa" w:w="4536"/>
+          </w:tcPr>
+          <w:p>
+            <w:r/>
+            <w:r>
+              <w:t>Instances</w:t>
+            </w:r>
+          </w:p>
+        </w:tc>
+        <w:tc>
+          <w:tcPr>
+            <w:tcW w:type="dxa" w:w="4536"/>
+          </w:tcPr>
+          <w:p>
+            <w:r/>
+            <w:r>
+              <w:t>8, 12 and 20 stores; 3 warehouses; coordinates uniform on [0,300]²</w:t>
+            </w:r>
+          </w:p>
+        </w:tc>
+      </w:tr>
+      <w:tr>
+        <w:tc>
+          <w:tcPr>
+            <w:tcW w:type="dxa" w:w="4536"/>
+          </w:tcPr>
+          <w:p>
+            <w:r/>
+            <w:r>
+              <w:t>Shelf life, ages, MLOR</w:t>
+            </w:r>
+          </w:p>
+        </w:tc>
+        <w:tc>
+          <w:tcPr>
+            <w:tcW w:type="dxa" w:w="4536"/>
+          </w:tcPr>
+          <w:p>
+            <w:r/>
+            <w:r>
+              <w:t>6 days; 0, 2.5, 4.5 days; 1, 2, 3 days</w:t>
+            </w:r>
+          </w:p>
+        </w:tc>
+      </w:tr>
+      <w:tr>
+        <w:tc>
+          <w:tcPr>
+            <w:tcW w:type="dxa" w:w="4536"/>
+          </w:tcPr>
+          <w:p>
+            <w:r/>
+            <w:r>
+              <w:t>Vehicle capacity</w:t>
+            </w:r>
+          </w:p>
+        </w:tc>
+        <w:tc>
+          <w:tcPr>
+            <w:tcW w:type="dxa" w:w="4536"/>
+          </w:tcPr>
+          <w:p>
+            <w:r/>
+            <w:r>
+              <w:t>4 stores</w:t>
+            </w:r>
+          </w:p>
+        </w:tc>
+      </w:tr>
+      <w:tr>
+        <w:tc>
+          <w:tcPr>
+            <w:tcW w:type="dxa" w:w="4536"/>
+          </w:tcPr>
+          <w:p>
+            <w:r/>
+            <w:r>
+              <w:t>Costs</w:t>
+            </w:r>
+          </w:p>
+        </w:tc>
+        <w:tc>
+          <w:tcPr>
+            <w:tcW w:type="dxa" w:w="4536"/>
+          </w:tcPr>
+          <w:p>
+            <w:r/>
+            <w:r>
+              <w:t>opening 100; vehicle 50; transport 0.5 per km; penalty 200 (sensitivity 0–800)</w:t>
+            </w:r>
+          </w:p>
+        </w:tc>
+      </w:tr>
+      <w:tr>
+        <w:tc>
+          <w:tcPr>
+            <w:tcW w:type="dxa" w:w="4536"/>
+          </w:tcPr>
+          <w:p>
+            <w:r/>
+            <w:r>
+              <w:t>ALNS</w:t>
+            </w:r>
+          </w:p>
+        </w:tc>
+        <w:tc>
+          <w:tcPr>
+            <w:tcW w:type="dxa" w:w="4536"/>
+          </w:tcPr>
+          <w:p>
+            <w:r/>
+            <w:r>
+              <w:t>200 iterations; destroy 2–4 default, 4–6 tuned; up to 2 unserved retries</w:t>
+            </w:r>
+          </w:p>
+        </w:tc>
+      </w:tr>
+      <w:tr>
+        <w:tc>
+          <w:tcPr>
+            <w:tcW w:type="dxa" w:w="4536"/>
+          </w:tcPr>
+          <w:p>
+            <w:r/>
+            <w:r>
+              <w:t>Exact DP</w:t>
+            </w:r>
+          </w:p>
+        </w:tc>
+        <w:tc>
+          <w:tcPr>
+            <w:tcW w:type="dxa" w:w="4536"/>
+          </w:tcPr>
+          <w:p>
+            <w:r/>
+            <w:r>
+              <w:t>all orders for subsets of up to 4 stores; 12 stores about 19 s</w:t>
+            </w:r>
+          </w:p>
+        </w:tc>
+      </w:tr>
+      <w:tr>
+        <w:tc>
+          <w:tcPr>
+            <w:tcW w:type="dxa" w:w="4536"/>
+          </w:tcPr>
+          <w:p>
+            <w:r/>
+            <w:r>
+              <w:t>Seeds</w:t>
+            </w:r>
+          </w:p>
+        </w:tc>
+        <w:tc>
+          <w:tcPr>
+            <w:tcW w:type="dxa" w:w="4536"/>
+          </w:tcPr>
+          <w:p>
+            <w:r/>
+            <w:r>
+              <w:t>0–9 full sample; 5–9 development; 10–19 test</w:t>
+            </w:r>
+          </w:p>
+        </w:tc>
+      </w:tr>
+      <w:tr>
+        <w:tc>
+          <w:tcPr>
+            <w:tcW w:type="dxa" w:w="4536"/>
+          </w:tcPr>
+          <w:p>
+            <w:r/>
+            <w:r>
+              <w:t>Environment</w:t>
+            </w:r>
+          </w:p>
+        </w:tc>
+        <w:tc>
+          <w:tcPr>
+            <w:tcW w:type="dxa" w:w="4536"/>
+          </w:tcPr>
+          <w:p>
+            <w:r/>
+            <w:r>
+              <w:t>Python 3, single-threaded; no commercial solver in the loop</w:t>
+            </w:r>
+          </w:p>
+        </w:tc>
+      </w:tr>
+    </w:tbl>
+    <w:p/>
     <w:p>
       <w:r>
         <w:t>The real-network illustration is separate: it uses three contest regional warehouses (Guangzhou, Dongguan, Chengdu), the twelve nearest contest cities, the contest last-leg rate of 1.45 per ton-km, unit demand, and rule-based ages and thresholds. It is an illustration on real geography, not a case study.</w:t>
@@ -1030,7 +1662,7 @@
         <w:rPr>
           <w:i/>
         </w:rPr>
-        <w:t>*Table 2. Means and 95% confidence intervals for the main comparisons.*</w:t>
+        <w:t>*Table 4. Means and 95% confidence intervals for the main comparisons.*</w:t>
       </w:r>
     </w:p>
     <w:tbl>
@@ -1809,6 +2441,29 @@
         <w:pStyle w:val="Heading2"/>
       </w:pPr>
       <w:r>
+        <w:t>Data availability</w:t>
+      </w:r>
+    </w:p>
+    <w:p>
+      <w:r>
+        <w:t xml:space="preserve">All synthetic instances are generated by the code described in this paper. The real-network illustration uses the contest location, warehouse and order files. No confidential or proprietary data were used. The experiment outputs are stored under </w:t>
+      </w:r>
+      <w:r>
+        <w:rPr>
+          <w:rFonts w:ascii="Consolas" w:hAnsi="Consolas"/>
+          <w:sz w:val="18"/>
+        </w:rPr>
+        <w:t>results/experiments/</w:t>
+      </w:r>
+      <w:r>
+        <w:t xml:space="preserve"> in the project repository.</w:t>
+      </w:r>
+    </w:p>
+    <w:p>
+      <w:pPr>
+        <w:pStyle w:val="Heading2"/>
+      </w:pPr>
+      <w:r>
         <w:t>References</w:t>
       </w:r>
     </w:p>

</xml_diff>

<commit_message>
Add an equal-evaluation simulated annealing comparison
</commit_message>
<xml_diff>
--- a/docs/paper/MLOR_MANUSCRIPT.docx
+++ b/docs/paper/MLOR_MANUSCRIPT.docx
@@ -1484,6 +1484,11 @@
       </w:r>
     </w:p>
     <w:p>
+      <w:r>
+        <w:t>To test whether the advantage is specific to the ALNS neighborhood, we ran a simulated annealing baseline with a geometric cooling schedule, starting from the same greedy solution and using the same number of solution evaluations as the ALNS on each instance. At 12 stores, SA reaches a mean gap of 63.95 with 4/10 optima, while the tuned ALNS reaches 1.27 with 9/10; ALNS is better on 5/10 instances, SA on 1/10, and they tie on 4/10. SA is not tuned beyond the cooling schedule, and the evaluation count is not a full operation count, so the comparison is indicative rather than a definitive ranking; it does show that the ALNS neighborhood is not trivially replaceable by a generic local search.</w:t>
+      </w:r>
+    </w:p>
+    <w:p>
       <w:pPr>
         <w:jc w:val="center"/>
       </w:pPr>

</xml_diff>

<commit_message>
Add a table for the alternative-metaheuristic comparison
</commit_message>
<xml_diff>
--- a/docs/paper/MLOR_MANUSCRIPT.docx
+++ b/docs/paper/MLOR_MANUSCRIPT.docx
@@ -1489,6 +1489,270 @@
       </w:r>
     </w:p>
     <w:p>
+      <w:r>
+        <w:rPr>
+          <w:i/>
+        </w:rPr>
+        <w:t>*Table 5. Alternative metaheuristics at the same solution-evaluation budget (12 stores).*</w:t>
+      </w:r>
+    </w:p>
+    <w:tbl>
+      <w:tblPr>
+        <w:tblStyle w:val="TableGrid"/>
+        <w:tblW w:type="auto" w:w="0"/>
+        <w:tblLook w:firstColumn="1" w:firstRow="1" w:lastColumn="0" w:lastRow="0" w:noHBand="0" w:noVBand="1" w:val="04A0"/>
+      </w:tblPr>
+      <w:tblGrid>
+        <w:gridCol w:w="2268"/>
+        <w:gridCol w:w="2268"/>
+        <w:gridCol w:w="2268"/>
+        <w:gridCol w:w="2268"/>
+      </w:tblGrid>
+      <w:tr>
+        <w:tc>
+          <w:tcPr>
+            <w:tcW w:type="dxa" w:w="2268"/>
+          </w:tcPr>
+          <w:p>
+            <w:r/>
+            <w:r>
+              <w:rPr>
+                <w:b/>
+              </w:rPr>
+              <w:t>Method</w:t>
+            </w:r>
+          </w:p>
+        </w:tc>
+        <w:tc>
+          <w:tcPr>
+            <w:tcW w:type="dxa" w:w="2268"/>
+          </w:tcPr>
+          <w:p>
+            <w:r/>
+            <w:r>
+              <w:rPr>
+                <w:b/>
+              </w:rPr>
+              <w:t>Mean gap</w:t>
+            </w:r>
+          </w:p>
+        </w:tc>
+        <w:tc>
+          <w:tcPr>
+            <w:tcW w:type="dxa" w:w="2268"/>
+          </w:tcPr>
+          <w:p>
+            <w:r/>
+            <w:r>
+              <w:rPr>
+                <w:b/>
+              </w:rPr>
+              <w:t>Optimal</w:t>
+            </w:r>
+          </w:p>
+        </w:tc>
+        <w:tc>
+          <w:tcPr>
+            <w:tcW w:type="dxa" w:w="2268"/>
+          </w:tcPr>
+          <w:p>
+            <w:r/>
+            <w:r>
+              <w:rPr>
+                <w:b/>
+              </w:rPr>
+              <w:t>Better than ALNS</w:t>
+            </w:r>
+          </w:p>
+        </w:tc>
+      </w:tr>
+      <w:tr>
+        <w:tc>
+          <w:tcPr>
+            <w:tcW w:type="dxa" w:w="2268"/>
+          </w:tcPr>
+          <w:p>
+            <w:r/>
+            <w:r>
+              <w:t>ALNS (destroy 4–6)</w:t>
+            </w:r>
+          </w:p>
+        </w:tc>
+        <w:tc>
+          <w:tcPr>
+            <w:tcW w:type="dxa" w:w="2268"/>
+          </w:tcPr>
+          <w:p>
+            <w:r/>
+            <w:r>
+              <w:t>1.27</w:t>
+            </w:r>
+          </w:p>
+        </w:tc>
+        <w:tc>
+          <w:tcPr>
+            <w:tcW w:type="dxa" w:w="2268"/>
+          </w:tcPr>
+          <w:p>
+            <w:r/>
+            <w:r>
+              <w:t>9/10</w:t>
+            </w:r>
+          </w:p>
+        </w:tc>
+        <w:tc>
+          <w:tcPr>
+            <w:tcW w:type="dxa" w:w="2268"/>
+          </w:tcPr>
+          <w:p>
+            <w:r/>
+            <w:r>
+              <w:t>—</w:t>
+            </w:r>
+          </w:p>
+        </w:tc>
+      </w:tr>
+      <w:tr>
+        <w:tc>
+          <w:tcPr>
+            <w:tcW w:type="dxa" w:w="2268"/>
+          </w:tcPr>
+          <w:p>
+            <w:r/>
+            <w:r>
+              <w:t>SA (geometric cooling)</w:t>
+            </w:r>
+          </w:p>
+        </w:tc>
+        <w:tc>
+          <w:tcPr>
+            <w:tcW w:type="dxa" w:w="2268"/>
+          </w:tcPr>
+          <w:p>
+            <w:r/>
+            <w:r>
+              <w:t>63.95</w:t>
+            </w:r>
+          </w:p>
+        </w:tc>
+        <w:tc>
+          <w:tcPr>
+            <w:tcW w:type="dxa" w:w="2268"/>
+          </w:tcPr>
+          <w:p>
+            <w:r/>
+            <w:r>
+              <w:t>4/10</w:t>
+            </w:r>
+          </w:p>
+        </w:tc>
+        <w:tc>
+          <w:tcPr>
+            <w:tcW w:type="dxa" w:w="2268"/>
+          </w:tcPr>
+          <w:p>
+            <w:r/>
+            <w:r>
+              <w:t>1/10</w:t>
+            </w:r>
+          </w:p>
+        </w:tc>
+      </w:tr>
+      <w:tr>
+        <w:tc>
+          <w:tcPr>
+            <w:tcW w:type="dxa" w:w="2268"/>
+          </w:tcPr>
+          <w:p>
+            <w:r/>
+            <w:r>
+              <w:t>Tabu (tenure 7)</w:t>
+            </w:r>
+          </w:p>
+        </w:tc>
+        <w:tc>
+          <w:tcPr>
+            <w:tcW w:type="dxa" w:w="2268"/>
+          </w:tcPr>
+          <w:p>
+            <w:r/>
+            <w:r>
+              <w:t>85.21</w:t>
+            </w:r>
+          </w:p>
+        </w:tc>
+        <w:tc>
+          <w:tcPr>
+            <w:tcW w:type="dxa" w:w="2268"/>
+          </w:tcPr>
+          <w:p>
+            <w:r/>
+            <w:r>
+              <w:t>2/10</w:t>
+            </w:r>
+          </w:p>
+        </w:tc>
+        <w:tc>
+          <w:tcPr>
+            <w:tcW w:type="dxa" w:w="2268"/>
+          </w:tcPr>
+          <w:p>
+            <w:r/>
+            <w:r>
+              <w:t>0/10</w:t>
+            </w:r>
+          </w:p>
+        </w:tc>
+      </w:tr>
+      <w:tr>
+        <w:tc>
+          <w:tcPr>
+            <w:tcW w:type="dxa" w:w="2268"/>
+          </w:tcPr>
+          <w:p>
+            <w:r/>
+            <w:r>
+              <w:t>GA (population 20)</w:t>
+            </w:r>
+          </w:p>
+        </w:tc>
+        <w:tc>
+          <w:tcPr>
+            <w:tcW w:type="dxa" w:w="2268"/>
+          </w:tcPr>
+          <w:p>
+            <w:r/>
+            <w:r>
+              <w:t>72.02</w:t>
+            </w:r>
+          </w:p>
+        </w:tc>
+        <w:tc>
+          <w:tcPr>
+            <w:tcW w:type="dxa" w:w="2268"/>
+          </w:tcPr>
+          <w:p>
+            <w:r/>
+            <w:r>
+              <w:t>2/10</w:t>
+            </w:r>
+          </w:p>
+        </w:tc>
+        <w:tc>
+          <w:tcPr>
+            <w:tcW w:type="dxa" w:w="2268"/>
+          </w:tcPr>
+          <w:p>
+            <w:r/>
+            <w:r>
+              <w:t>0/10</w:t>
+            </w:r>
+          </w:p>
+        </w:tc>
+      </w:tr>
+    </w:tbl>
+    <w:p/>
+    <w:p>
       <w:pPr>
         <w:jc w:val="center"/>
       </w:pPr>

</xml_diff>

<commit_message>
Add the competing-interest declaration
</commit_message>
<xml_diff>
--- a/docs/paper/MLOR_MANUSCRIPT.docx
+++ b/docs/paper/MLOR_MANUSCRIPT.docx
@@ -2710,6 +2710,19 @@
         <w:pStyle w:val="Heading2"/>
       </w:pPr>
       <w:r>
+        <w:t>Declaration of competing interest</w:t>
+      </w:r>
+    </w:p>
+    <w:p>
+      <w:r>
+        <w:t>The authors declare that they have no known competing financial interests or personal relationships that could have appeared to influence the work reported in this paper.</w:t>
+      </w:r>
+    </w:p>
+    <w:p>
+      <w:pPr>
+        <w:pStyle w:val="Heading2"/>
+      </w:pPr>
+      <w:r>
         <w:t>Data availability</w:t>
       </w:r>
     </w:p>

</xml_diff>

<commit_message>
Align table labels and add a CIE cover letter
</commit_message>
<xml_diff>
--- a/docs/paper/MLOR_MANUSCRIPT.docx
+++ b/docs/paper/MLOR_MANUSCRIPT.docx
@@ -1493,7 +1493,7 @@
         <w:rPr>
           <w:i/>
         </w:rPr>
-        <w:t>*Table 5. Alternative metaheuristics at the same solution-evaluation budget (12 stores).*</w:t>
+        <w:t>*Table 4. Alternative metaheuristics at the same solution-evaluation budget (12 stores).*</w:t>
       </w:r>
     </w:p>
     <w:tbl>
@@ -1931,7 +1931,7 @@
         <w:rPr>
           <w:i/>
         </w:rPr>
-        <w:t>*Table 4. Means and 95% confidence intervals for the main comparisons.*</w:t>
+        <w:t>*Table 5. Means and 95% confidence intervals for the main comparisons.*</w:t>
       </w:r>
     </w:p>
     <w:tbl>

</xml_diff>

<commit_message>
Add appendix traceability note and fix spacing
</commit_message>
<xml_diff>
--- a/docs/paper/MLOR_MANUSCRIPT.docx
+++ b/docs/paper/MLOR_MANUSCRIPT.docx
@@ -2662,6 +2662,21 @@
     <w:p/>
     <w:p>
       <w:r>
+        <w:t xml:space="preserve">Full experiment directory names carry a date suffix (for example, </w:t>
+      </w:r>
+      <w:r>
+        <w:rPr>
+          <w:rFonts w:ascii="Consolas" w:hAnsi="Consolas"/>
+          <w:sz w:val="18"/>
+        </w:rPr>
+        <w:t>mlor-dp-20261028</w:t>
+      </w:r>
+      <w:r>
+        <w:t>); the table lists task names.</w:t>
+      </w:r>
+    </w:p>
+    <w:p>
+      <w:r>
         <w:t xml:space="preserve">All experiment outputs are under </w:t>
       </w:r>
       <w:r>

</xml_diff>

<commit_message>
Complete and correct the DOI-verified reference metadata
</commit_message>
<xml_diff>
--- a/docs/paper/MLOR_MANUSCRIPT.docx
+++ b/docs/paper/MLOR_MANUSCRIPT.docx
@@ -206,7 +206,7 @@
         <w:t>Source note.</w:t>
       </w:r>
       <w:r>
-        <w:t xml:space="preserve"> The full texts of Crama et al. (2018) and Rohmer et al. (2019) were read. The descriptions of Coelho and Laporte (2014) and Govindan et al. (2014) are based on abstracts and metadata, not full-text reading. Qiu et al. (2019) and Singh and Kuthambalayan (2022) are cited from metadata because their full texts are closed access. These citations must be verified before submission.</w:t>
+        <w:t xml:space="preserve"> The full texts of Crama et al. (2018) and Rohmer et al. (2019) were read. The descriptions of Coelho and Laporte (2014) and Govindan et al. (2014) are based on abstracts and metadata, not full-text reading. Qiu et al. (2019) and Singh and Kuthambalayan (2022) are cited from metadata because their full texts are closed access. Bibliographic metadata were checked against DOI records; the full texts of Qiu et al. (2019) and Singh and Kuthambalayan (2022) remain closed access.</w:t>
       </w:r>
     </w:p>
     <w:p>
@@ -2771,7 +2771,7 @@
     </w:p>
     <w:p>
       <w:r>
-        <w:t>Crama, Y., Rezaei, M., Savelsbergh, M., Van Woensel, T., 2018. Stochastic inventory routing for perishable products. Transportation Science.</w:t>
+        <w:t>Crama, Y., Rezaei, M., Savelsbergh, M., Van Woensel, T., 2018. Stochastic inventory routing for perishable products. Transportation Science 52 (3), 526–546.</w:t>
       </w:r>
     </w:p>
     <w:p>
@@ -2781,7 +2781,7 @@
     </w:p>
     <w:p>
       <w:r>
-        <w:t>Qiu, Y., Qiao, J., Pardalos, P.M., 2019. Optimal production, replenishment, delivery, routing and inventory management policies for products with perishable inventory. Omega.</w:t>
+        <w:t>Qiu, Y., Qiao, J., Pardalos, P.M., 2019. Optimal production, replenishment, delivery, routing and inventory management policies for products with perishable inventory. Omega 82, 193–204.</w:t>
       </w:r>
     </w:p>
     <w:p>
@@ -2791,7 +2791,7 @@
     </w:p>
     <w:p>
       <w:r>
-        <w:t>Singh, N.K., Kuthambalayan, T.S., 2022. Integrating operations and marketing decisions to manage perishability risks with target minimum remaining shelf-life available to consumers. Computers &amp; Industrial Engineering 164, 107812.</w:t>
+        <w:t>Singh, N.K., Kuthambalayan, T.S., 2022. Integrating operations and marketing decisions to manage perishability risks with target minimum remaining shelf-life available to consumers. Computers &amp; Industrial Engineering 163, 107812.</w:t>
       </w:r>
     </w:p>
     <w:sectPr>

</xml_diff>

<commit_message>
Add a runtime comparison and correct the DP timing claim
</commit_message>
<xml_diff>
--- a/docs/paper/MLOR_MANUSCRIPT.docx
+++ b/docs/paper/MLOR_MANUSCRIPT.docx
@@ -1387,7 +1387,7 @@
           <w:p>
             <w:r/>
             <w:r>
-              <w:t>all orders for subsets of up to 4 stores; 12 stores about 19 s</w:t>
+              <w:t>all orders for subsets of up to 4 stores; 12 stores about 6 s</w:t>
             </w:r>
           </w:p>
         </w:tc>
@@ -2237,6 +2237,325 @@
     </w:tbl>
     <w:p/>
     <w:p>
+      <w:r>
+        <w:t>Table 6 reports single-process wall-clock time for three seeds per size. The exact DP is already slower than every heuristic at 12 stores (5.96 s versus at most 0.19 s), and it is not run at 20 stores. The four heuristics remain below 0.3 s at 20 stores. The ranking of heuristic times is not the ranking of solution quality: SA and tabu are faster than the ALNS but produce worse plans (Table 4). Times are implementation- and machine-dependent and are not a hardware-independent benchmark.</w:t>
+      </w:r>
+    </w:p>
+    <w:p>
+      <w:r>
+        <w:rPr>
+          <w:i/>
+        </w:rPr>
+        <w:t>*Table 6. Wall-clock runtime (seconds, mean over three seeds).*</w:t>
+      </w:r>
+    </w:p>
+    <w:tbl>
+      <w:tblPr>
+        <w:tblStyle w:val="TableGrid"/>
+        <w:tblW w:type="auto" w:w="0"/>
+        <w:tblLook w:firstColumn="1" w:firstRow="1" w:lastColumn="0" w:lastRow="0" w:noHBand="0" w:noVBand="1" w:val="04A0"/>
+      </w:tblPr>
+      <w:tblGrid>
+        <w:gridCol w:w="1512"/>
+        <w:gridCol w:w="1512"/>
+        <w:gridCol w:w="1512"/>
+        <w:gridCol w:w="1512"/>
+        <w:gridCol w:w="1512"/>
+        <w:gridCol w:w="1512"/>
+      </w:tblGrid>
+      <w:tr>
+        <w:tc>
+          <w:tcPr>
+            <w:tcW w:type="dxa" w:w="1512"/>
+          </w:tcPr>
+          <w:p>
+            <w:r/>
+            <w:r>
+              <w:rPr>
+                <w:b/>
+              </w:rPr>
+              <w:t>Stores</w:t>
+            </w:r>
+          </w:p>
+        </w:tc>
+        <w:tc>
+          <w:tcPr>
+            <w:tcW w:type="dxa" w:w="1512"/>
+          </w:tcPr>
+          <w:p>
+            <w:r/>
+            <w:r>
+              <w:rPr>
+                <w:b/>
+              </w:rPr>
+              <w:t>DP</w:t>
+            </w:r>
+          </w:p>
+        </w:tc>
+        <w:tc>
+          <w:tcPr>
+            <w:tcW w:type="dxa" w:w="1512"/>
+          </w:tcPr>
+          <w:p>
+            <w:r/>
+            <w:r>
+              <w:rPr>
+                <w:b/>
+              </w:rPr>
+              <w:t>ALNS</w:t>
+            </w:r>
+          </w:p>
+        </w:tc>
+        <w:tc>
+          <w:tcPr>
+            <w:tcW w:type="dxa" w:w="1512"/>
+          </w:tcPr>
+          <w:p>
+            <w:r/>
+            <w:r>
+              <w:rPr>
+                <w:b/>
+              </w:rPr>
+              <w:t>SA</w:t>
+            </w:r>
+          </w:p>
+        </w:tc>
+        <w:tc>
+          <w:tcPr>
+            <w:tcW w:type="dxa" w:w="1512"/>
+          </w:tcPr>
+          <w:p>
+            <w:r/>
+            <w:r>
+              <w:rPr>
+                <w:b/>
+              </w:rPr>
+              <w:t>Tabu</w:t>
+            </w:r>
+          </w:p>
+        </w:tc>
+        <w:tc>
+          <w:tcPr>
+            <w:tcW w:type="dxa" w:w="1512"/>
+          </w:tcPr>
+          <w:p>
+            <w:r/>
+            <w:r>
+              <w:rPr>
+                <w:b/>
+              </w:rPr>
+              <w:t>GA</w:t>
+            </w:r>
+          </w:p>
+        </w:tc>
+      </w:tr>
+      <w:tr>
+        <w:tc>
+          <w:tcPr>
+            <w:tcW w:type="dxa" w:w="1512"/>
+          </w:tcPr>
+          <w:p>
+            <w:r/>
+            <w:r>
+              <w:t>8</w:t>
+            </w:r>
+          </w:p>
+        </w:tc>
+        <w:tc>
+          <w:tcPr>
+            <w:tcW w:type="dxa" w:w="1512"/>
+          </w:tcPr>
+          <w:p>
+            <w:r/>
+            <w:r>
+              <w:t>0.06</w:t>
+            </w:r>
+          </w:p>
+        </w:tc>
+        <w:tc>
+          <w:tcPr>
+            <w:tcW w:type="dxa" w:w="1512"/>
+          </w:tcPr>
+          <w:p>
+            <w:r/>
+            <w:r>
+              <w:t>0.08</w:t>
+            </w:r>
+          </w:p>
+        </w:tc>
+        <w:tc>
+          <w:tcPr>
+            <w:tcW w:type="dxa" w:w="1512"/>
+          </w:tcPr>
+          <w:p>
+            <w:r/>
+            <w:r>
+              <w:t>0.04</w:t>
+            </w:r>
+          </w:p>
+        </w:tc>
+        <w:tc>
+          <w:tcPr>
+            <w:tcW w:type="dxa" w:w="1512"/>
+          </w:tcPr>
+          <w:p>
+            <w:r/>
+            <w:r>
+              <w:t>0.03</w:t>
+            </w:r>
+          </w:p>
+        </w:tc>
+        <w:tc>
+          <w:tcPr>
+            <w:tcW w:type="dxa" w:w="1512"/>
+          </w:tcPr>
+          <w:p>
+            <w:r/>
+            <w:r>
+              <w:t>0.16</w:t>
+            </w:r>
+          </w:p>
+        </w:tc>
+      </w:tr>
+      <w:tr>
+        <w:tc>
+          <w:tcPr>
+            <w:tcW w:type="dxa" w:w="1512"/>
+          </w:tcPr>
+          <w:p>
+            <w:r/>
+            <w:r>
+              <w:t>12</w:t>
+            </w:r>
+          </w:p>
+        </w:tc>
+        <w:tc>
+          <w:tcPr>
+            <w:tcW w:type="dxa" w:w="1512"/>
+          </w:tcPr>
+          <w:p>
+            <w:r/>
+            <w:r>
+              <w:t>5.96</w:t>
+            </w:r>
+          </w:p>
+        </w:tc>
+        <w:tc>
+          <w:tcPr>
+            <w:tcW w:type="dxa" w:w="1512"/>
+          </w:tcPr>
+          <w:p>
+            <w:r/>
+            <w:r>
+              <w:t>0.10</w:t>
+            </w:r>
+          </w:p>
+        </w:tc>
+        <w:tc>
+          <w:tcPr>
+            <w:tcW w:type="dxa" w:w="1512"/>
+          </w:tcPr>
+          <w:p>
+            <w:r/>
+            <w:r>
+              <w:t>0.04</w:t>
+            </w:r>
+          </w:p>
+        </w:tc>
+        <w:tc>
+          <w:tcPr>
+            <w:tcW w:type="dxa" w:w="1512"/>
+          </w:tcPr>
+          <w:p>
+            <w:r/>
+            <w:r>
+              <w:t>0.02</w:t>
+            </w:r>
+          </w:p>
+        </w:tc>
+        <w:tc>
+          <w:tcPr>
+            <w:tcW w:type="dxa" w:w="1512"/>
+          </w:tcPr>
+          <w:p>
+            <w:r/>
+            <w:r>
+              <w:t>0.19</w:t>
+            </w:r>
+          </w:p>
+        </w:tc>
+      </w:tr>
+      <w:tr>
+        <w:tc>
+          <w:tcPr>
+            <w:tcW w:type="dxa" w:w="1512"/>
+          </w:tcPr>
+          <w:p>
+            <w:r/>
+            <w:r>
+              <w:t>20</w:t>
+            </w:r>
+          </w:p>
+        </w:tc>
+        <w:tc>
+          <w:tcPr>
+            <w:tcW w:type="dxa" w:w="1512"/>
+          </w:tcPr>
+          <w:p>
+            <w:r/>
+            <w:r>
+              <w:t>—</w:t>
+            </w:r>
+          </w:p>
+        </w:tc>
+        <w:tc>
+          <w:tcPr>
+            <w:tcW w:type="dxa" w:w="1512"/>
+          </w:tcPr>
+          <w:p>
+            <w:r/>
+            <w:r>
+              <w:t>0.18</w:t>
+            </w:r>
+          </w:p>
+        </w:tc>
+        <w:tc>
+          <w:tcPr>
+            <w:tcW w:type="dxa" w:w="1512"/>
+          </w:tcPr>
+          <w:p>
+            <w:r/>
+            <w:r>
+              <w:t>0.06</w:t>
+            </w:r>
+          </w:p>
+        </w:tc>
+        <w:tc>
+          <w:tcPr>
+            <w:tcW w:type="dxa" w:w="1512"/>
+          </w:tcPr>
+          <w:p>
+            <w:r/>
+            <w:r>
+              <w:t>0.01</w:t>
+            </w:r>
+          </w:p>
+        </w:tc>
+        <w:tc>
+          <w:tcPr>
+            <w:tcW w:type="dxa" w:w="1512"/>
+          </w:tcPr>
+          <w:p>
+            <w:r/>
+            <w:r>
+              <w:t>0.26</w:t>
+            </w:r>
+          </w:p>
+        </w:tc>
+      </w:tr>
+    </w:tbl>
+    <w:p/>
+    <w:p>
       <w:pPr>
         <w:pStyle w:val="Heading3"/>
       </w:pPr>

</xml_diff>

<commit_message>
Fix figure numbering and DOCX table captions
</commit_message>
<xml_diff>
--- a/docs/paper/MLOR_MANUSCRIPT.docx
+++ b/docs/paper/MLOR_MANUSCRIPT.docx
@@ -238,9 +238,9 @@
     <w:p>
       <w:r>
         <w:rPr>
-          <w:i/>
+          <w:b/>
         </w:rPr>
-        <w:t>*Table 1. Notation.*</w:t>
+        <w:t>Table 1. Notation.</w:t>
       </w:r>
     </w:p>
     <w:tbl>
@@ -552,9 +552,9 @@
     <w:p>
       <w:r>
         <w:rPr>
-          <w:i/>
+          <w:b/>
         </w:rPr>
-        <w:t>*Table 2. Modeled and unmodeled dimensions.*</w:t>
+        <w:t>Table 2. Modeled and unmodeled dimensions.</w:t>
       </w:r>
     </w:p>
     <w:tbl>
@@ -1203,9 +1203,9 @@
     <w:p>
       <w:r>
         <w:rPr>
-          <w:i/>
+          <w:b/>
         </w:rPr>
-        <w:t>*Table 3. Experimental settings.*</w:t>
+        <w:t>Table 3. Experimental settings.</w:t>
       </w:r>
     </w:p>
     <w:tbl>
@@ -1491,9 +1491,9 @@
     <w:p>
       <w:r>
         <w:rPr>
-          <w:i/>
+          <w:b/>
         </w:rPr>
-        <w:t>*Table 4. Alternative metaheuristics at the same solution-evaluation budget (12 stores).*</w:t>
+        <w:t>Table 4. Alternative metaheuristics at the same solution-evaluation budget (12 stores).</w:t>
       </w:r>
     </w:p>
     <w:tbl>
@@ -1796,7 +1796,7 @@
         <w:rPr>
           <w:i/>
         </w:rPr>
-        <w:t>Figure 2. ALNS ablation at 12 stores: mean gap to the exact optimum for greedy, no-unserved-retry, and full ALNS.</w:t>
+        <w:t>Figure 1. ALNS ablation at 12 stores: mean gap to the exact optimum for greedy, no-unserved-retry, and full ALNS.</w:t>
       </w:r>
     </w:p>
     <w:p>
@@ -1897,7 +1897,7 @@
         <w:rPr>
           <w:i/>
         </w:rPr>
-        <w:t>Figure 1. Penalty sensitivity: mean gap between the age-blind and age-aware plans as the per-delivery rejection penalty grows; the break-even is about 7.</w:t>
+        <w:t>Figure 2. Penalty sensitivity: mean gap between the age-blind and age-aware plans as the per-delivery rejection penalty grows; the break-even is about 7.</w:t>
       </w:r>
     </w:p>
     <w:p>
@@ -1929,9 +1929,9 @@
     <w:p>
       <w:r>
         <w:rPr>
-          <w:i/>
+          <w:b/>
         </w:rPr>
-        <w:t>*Table 5. Means and 95% confidence intervals for the main comparisons.*</w:t>
+        <w:t>Table 5. Means and 95% confidence intervals for the main comparisons.</w:t>
       </w:r>
     </w:p>
     <w:tbl>
@@ -2244,9 +2244,9 @@
     <w:p>
       <w:r>
         <w:rPr>
-          <w:i/>
+          <w:b/>
         </w:rPr>
-        <w:t>*Table 6. Wall-clock runtime (seconds, mean over three seeds).*</w:t>
+        <w:t>Table 6. Wall-clock runtime (seconds, mean over three seeds).</w:t>
       </w:r>
     </w:p>
     <w:tbl>

</xml_diff>

<commit_message>
Add an age-error robustness check
</commit_message>
<xml_diff>
--- a/docs/paper/MLOR_MANUSCRIPT.docx
+++ b/docs/paper/MLOR_MANUSCRIPT.docx
@@ -1850,6 +1850,11 @@
     </w:p>
     <w:p>
       <w:r>
+        <w:t>Robustness to age estimation error. The nominal plans are also evaluated when warehouse ages are misestimated. For ten twelve-store instances and 50 scenarios, each warehouse age is shifted independently by a uniform draw on [-0.5, 0.5] days, and the age-aware and age-blind plans are re-evaluated without re-optimization. The age-aware plan has mean cost 805.9 versus 2610.7 for the blind plan and is better in 100% of scenarios; infeasible deliveries average 0.29 versus 7.32 per scenario. The check is one-sided: travel time and demand remain deterministic, so it supports plan robustness to age error, not a stochastic optimization claim.</w:t>
+      </w:r>
+    </w:p>
+    <w:p>
+      <w:r>
         <w:t>At 20 stores, an LP relaxation of the set-partitioning model provides a lower bound. The LP allows fractional routes and fractional opening; the mean relative gap between the ALNS cost and this bound is 9.0%, with a maximum of 14.1%. Because the relaxation is weak, this is a loose upper bound on the true gap, not an optimality proof.</w:t>
       </w:r>
     </w:p>

</xml_diff>